<commit_message>
revisione documentazione vendite e spedizione
</commit_message>
<xml_diff>
--- a/docs/ERP Prodotti Chimici - scopo e necessita.docx
+++ b/docs/ERP Prodotti Chimici - scopo e necessita.docx
@@ -7,16 +7,7 @@
         <w:pStyle w:val="Titolo"/>
       </w:pPr>
       <w:r>
-        <w:t xml:space="preserve">Quack </w:t>
-      </w:r>
-      <w:r>
-        <w:t xml:space="preserve">ERP </w:t>
-      </w:r>
-      <w:r>
-        <w:t xml:space="preserve">Prodotti </w:t>
-      </w:r>
-      <w:r>
-        <w:t>Chimici - Note di progetto</w:t>
+        <w:t xml:space="preserve">Quack ERP Prodotti Chimici - Note di progetto</w:t>
       </w:r>
     </w:p>
     <w:p>
@@ -24,25 +15,7 @@
         <w:pStyle w:val="Sottotitolo"/>
       </w:pPr>
       <w:r>
-        <w:t xml:space="preserve">Appunti su cosa </w:t>
-      </w:r>
-      <w:r>
-        <w:t xml:space="preserve">dovrebbe fare </w:t>
-      </w:r>
-      <w:r>
-        <w:t>st</w:t>
-      </w:r>
-      <w:r>
-        <w:t>a web app</w:t>
-      </w:r>
-      <w:r>
-        <w:t>, come funziona e perch</w:t>
-      </w:r>
-      <w:r>
-        <w:t>é</w:t>
-      </w:r>
-      <w:r>
-        <w:t xml:space="preserve"> sono state fatte certe scelte.</w:t>
+        <w:t xml:space="preserve">Appunti su cosa dovrebbe fare sta web app, come funziona e perché sono state fatte certe scelte.</w:t>
       </w:r>
     </w:p>
     <w:p>
@@ -50,82 +23,19 @@
         <w:pStyle w:val="Titolo1"/>
       </w:pPr>
       <w:r>
-        <w:t>Scopo</w:t>
-      </w:r>
-      <w:r>
-        <w:t xml:space="preserve"> Erp</w:t>
-      </w:r>
-    </w:p>
-    <w:p>
-      <w:r>
-        <w:t>Tra le attività di Gemina Srl c’è la vendita di prodotti chimici</w:t>
-      </w:r>
-      <w:r>
-        <w:t xml:space="preserve"> </w:t>
-      </w:r>
-      <w:r>
-        <w:t xml:space="preserve">per impianti di depurazione, </w:t>
-      </w:r>
-      <w:r>
-        <w:t xml:space="preserve">prodotti chimici per </w:t>
-      </w:r>
-      <w:r>
-        <w:t xml:space="preserve">gassificatori e prodotti </w:t>
-      </w:r>
-      <w:r>
-        <w:t xml:space="preserve">chimici </w:t>
-      </w:r>
-      <w:r>
-        <w:t xml:space="preserve">per piscina. </w:t>
+        <w:t xml:space="preserve">Scopo Erp</w:t>
+      </w:r>
+    </w:p>
+    <w:p>
+      <w:r>
+        <w:t xml:space="preserve">Tra le attività di Gemina Srl c’è la vendita di prodotti chimici per impianti di depurazione, prodotti chimici per gassificatori e prodotti chimici per piscina. </w:t>
       </w:r>
       <w:r>
         <w:rPr>
           <w:b/>
           <w:bCs/>
         </w:rPr>
-        <w:t xml:space="preserve">Lo scopo del progetto è creare una sorta di gestionale erp per la vendita </w:t>
-      </w:r>
-      <w:r>
-        <w:rPr>
-          <w:b/>
-          <w:bCs/>
-        </w:rPr>
-        <w:t xml:space="preserve">di questi prodotti, </w:t>
-      </w:r>
-      <w:r>
-        <w:rPr>
-          <w:b/>
-          <w:bCs/>
-        </w:rPr>
-        <w:t>talvolta adr</w:t>
-      </w:r>
-      <w:r>
-        <w:rPr>
-          <w:b/>
-          <w:bCs/>
-        </w:rPr>
-        <w:t xml:space="preserve"> (</w:t>
-      </w:r>
-      <w:r>
-        <w:rPr>
-          <w:b/>
-          <w:bCs/>
-        </w:rPr>
-        <w:t>cioè pericolosi</w:t>
-      </w:r>
-      <w:r>
-        <w:rPr>
-          <w:b/>
-          <w:bCs/>
-        </w:rPr>
-        <w:t>)</w:t>
-      </w:r>
-      <w:r>
-        <w:rPr>
-          <w:b/>
-          <w:bCs/>
-        </w:rPr>
-        <w:t>.</w:t>
+        <w:t xml:space="preserve">Lo scopo del progetto è creare una sorta di gestionale erp per la vendita di questi prodotti, talvolta adr (cioè pericolosi).</w:t>
       </w:r>
     </w:p>
     <w:p>
@@ -145,28 +55,7 @@
         </w:numPr>
       </w:pPr>
       <w:r>
-        <w:t>Gestire il ciclo ordini di prodotti piscina</w:t>
-      </w:r>
-      <w:r>
-        <w:t xml:space="preserve"> venduti al di fuori del nostro sito di e</w:t>
-      </w:r>
-      <w:r>
-        <w:t>-</w:t>
-      </w:r>
-      <w:r>
-        <w:t>commerce</w:t>
-      </w:r>
-      <w:r>
-        <w:t xml:space="preserve"> (canale di vendita 1). </w:t>
-      </w:r>
-      <w:r>
-        <w:t xml:space="preserve">Va dalla creazione di </w:t>
-      </w:r>
-      <w:r>
-        <w:t>richieste di preventivi al fornitore, alla creazione di preventivi per i clienti</w:t>
-      </w:r>
-      <w:r>
-        <w:t>, alla gestione dell’ordine, alla spedizione. Passando per anagrafiche e informazioni ADR</w:t>
+        <w:t xml:space="preserve">Gestire il ciclo ordini di prodotti piscina venduti al di fuori del nostro sito di e-commerce (canale di vendita 1). Va dalla creazione di richieste di preventivi al fornitore, alla creazione di preventivi per i clienti, alla gestione dell’ordine, alla spedizione. Passando per anagrafiche e informazioni ADR</w:t>
       </w:r>
     </w:p>
     <w:p>
@@ -178,13 +67,7 @@
         </w:numPr>
       </w:pPr>
       <w:r>
-        <w:t>Tracciare le attività del sito di e-commerce</w:t>
-      </w:r>
-      <w:r>
-        <w:t xml:space="preserve"> (canale di vendita 2)</w:t>
-      </w:r>
-      <w:r>
-        <w:t>. È un sito in Wordpress motorizzato WooCommerce. Si tratta quindi di</w:t>
+        <w:t xml:space="preserve">Tracciare le attività del sito di e-commerce (canale di vendita 2). È un sito in Wordpress motorizzato WooCommerce. Si tratta quindi di</w:t>
       </w:r>
     </w:p>
     <w:p>
@@ -234,21 +117,12 @@
     </w:p>
     <w:p>
       <w:r>
-        <w:t>Quindi riassumendo l’app deve</w:t>
-      </w:r>
-      <w:r>
-        <w:t>: tenere le anagrafiche in ordine, fare offerte ai clienti, controllare il magazzino, tracciare gli ordini. Tutto il resto viene dopo.</w:t>
-      </w:r>
-    </w:p>
-    <w:p>
-      <w:r>
-        <w:t>Si tratta di una web app da eseguire esclusivamente in locale, senza dipendenze da server esterni, che dovr</w:t>
-      </w:r>
-      <w:r>
-        <w:t>à</w:t>
-      </w:r>
-      <w:r>
-        <w:t xml:space="preserve"> però parlare con le api di WooCommerce.</w:t>
+        <w:t>Quindi riassumendo l’app deve: tenere le anagrafiche in ordine, fare offerte ai clienti, controllare il magazzino, tracciare gli ordini. Tutto il resto viene dopo.</w:t>
+      </w:r>
+    </w:p>
+    <w:p>
+      <w:r>
+        <w:t xml:space="preserve">Si tratta di una web app da eseguire esclusivamente in locale, senza dipendenze da server esterni, che dovrà però parlare con le api di WooCommerce.</w:t>
       </w:r>
     </w:p>
     <w:p>
@@ -258,24 +132,12 @@
     </w:p>
     <w:p>
       <w:r>
-        <w:t>Il DB parte in SQLite</w:t>
-      </w:r>
-      <w:r>
-        <w:t xml:space="preserve"> (perché più facile da migrare tra macchina di sviluppo e macchina utente)</w:t>
-      </w:r>
-      <w:r>
-        <w:t xml:space="preserve"> e in futuro passiamo a MySQL.</w:t>
-      </w:r>
-    </w:p>
-    <w:p>
-      <w:r>
-        <w:t>La web app gira in xampp</w:t>
-      </w:r>
-      <w:r>
-        <w:t xml:space="preserve"> o </w:t>
-      </w:r>
-      <w:r>
-        <w:t>laragon (quindi solo js+php+sqlite/mysql senza sovrastrutture inutili)</w:t>
+        <w:t xml:space="preserve">Il DB parte in SQLite (perché più facile da migrare tra macchina di sviluppo e macchina utente) e in futuro passiamo a MySQL.</w:t>
+      </w:r>
+    </w:p>
+    <w:p>
+      <w:r>
+        <w:t xml:space="preserve">La web app gira in xampp o laragon (quindi solo js+php+sqlite/mysql senza sovrastrutture inutili)</w:t>
       </w:r>
     </w:p>
     <w:p>
@@ -300,49 +162,22 @@
         <w:pStyle w:val="Titolo2"/>
       </w:pPr>
       <w:r>
-        <w:t>Descrizione ciclo vendita prodotti piscina extra sito</w:t>
-      </w:r>
-      <w:r>
-        <w:t xml:space="preserve"> (“dropshipping”)</w:t>
-      </w:r>
-    </w:p>
-    <w:p>
-      <w:r>
-        <w:t>Ci arriva la richiesta di prodotti (o direttamente dal cliente o tramite un fornitore che ci ha girato questi clienti). I miei colleghi chiamano impropriamente questa modalità dropshipping. In realtà noi</w:t>
-      </w:r>
-      <w:r>
-        <w:t xml:space="preserve">, se non abbiamo merce in pronta consegna </w:t>
-      </w:r>
-      <w:r>
-        <w:t>dobbiamo fare ordini comunque al fornitore e aspettare che arrivin</w:t>
-      </w:r>
-      <w:r>
-        <w:t>o nel nostro magazzino</w:t>
-      </w:r>
-      <w:r>
-        <w:t>.</w:t>
-      </w:r>
-      <w:r>
-        <w:t xml:space="preserve"> Il dropshipping all’italiana.</w:t>
-      </w:r>
-    </w:p>
-    <w:p>
-      <w:r>
-        <w:t>In un mondo ideale</w:t>
-      </w:r>
-      <w:r>
-        <w:t xml:space="preserve">, </w:t>
-      </w:r>
-      <w:r>
-        <w:t>appena la merce arriva in magazzino andrebbero aggiornate le giacenze che al momento tracciamo solo sul WooCommerce del sito.</w:t>
-      </w:r>
-    </w:p>
-    <w:p>
-      <w:r>
-        <w:t xml:space="preserve">In base a prezzi consigliati dal fornitore, alle quantità, e al morbin del commerciale di turno viene formulata un’offerta. È letteralmente un documento pdf/word con prezzi e quantità. Segue una fase serrata di contrattazione in cui sia commerciale che cliente minacciano di strapparsi le vesti. L’offerta viene eventualmente modificata/sostituita da una nuova. Se il cliente accetta diventa ordine. A quel punto i colleghi approntano i bancali con grande artigianato, viene prodotto un ddt e la merce viene spedita. </w:t>
-      </w:r>
-      <w:r>
-        <w:t>Può succedere che da un singolo ordine partano più spedizioni (e quindi più DDT): per esempio quando una parte della merce è già pronta e viene spedita subito, mentre il resto viene inviato appena disponibile.</w:t>
+        <w:t xml:space="preserve">Descrizione ciclo vendita prodotti piscina extra sito (“dropshipping”)</w:t>
+      </w:r>
+    </w:p>
+    <w:p>
+      <w:r>
+        <w:t xml:space="preserve">Ci arriva la richiesta di prodotti (o direttamente dal cliente o tramite un fornitore che ci ha girato questi clienti). I miei colleghi chiamano impropriamente questa modalità dropshipping. In realtà noi, se non abbiamo merce in pronta consegna dobbiamo fare ordini comunque al fornitore e aspettare che arrivino nel nostro magazzino. Il dropshipping all’italiana.</w:t>
+      </w:r>
+    </w:p>
+    <w:p>
+      <w:r>
+        <w:t xml:space="preserve">In un mondo ideale, appena la merce arriva in magazzino andrebbero aggiornate le giacenze che al momento tracciamo solo sul WooCommerce del sito.</w:t>
+      </w:r>
+    </w:p>
+    <w:p>
+      <w:r>
+        <w:t xml:space="preserve">In base a prezzi consigliati dal fornitore, alle quantità, e al morbin del commerciale di turno viene formulata un’offerta. È letteralmente un documento pdf/word con prezzi e quantità. Segue una fase serrata di contrattazione in cui sia commerciale che cliente minacciano di strapparsi le vesti. L’offerta viene eventualmente modificata/sostituita da una nuova. Se il cliente accetta diventa ordine. A quel punto i colleghi approntano i bancali con grande artigianato, viene prodotto un ddt e la merce viene spedita. Può succedere che da un singolo ordine partano più spedizioni (e quindi più DDT): per esempio quando una parte della merce è già pronta e viene spedita subito, mentre il resto viene inviato appena disponibile.</w:t>
       </w:r>
     </w:p>
     <w:p>
@@ -430,22 +265,7 @@
     </w:p>
     <w:p>
       <w:r>
-        <w:t>Per il momento consideriamo la procedura del tutto analoga all</w:t>
-      </w:r>
-      <w:r>
-        <w:t xml:space="preserve">a vendita di prodotti extra </w:t>
-      </w:r>
-      <w:r>
-        <w:t>–</w:t>
-      </w:r>
-      <w:r>
-        <w:t xml:space="preserve"> sito</w:t>
-      </w:r>
-      <w:r>
-        <w:t>. L’unica differenza è che non abbiamo ancora un sistema centralizzato che monitora la giacenza di questi prodotti</w:t>
-      </w:r>
-      <w:r>
-        <w:t xml:space="preserve">. </w:t>
+        <w:t xml:space="preserve">Per il momento consideriamo la procedura del tutto analoga alla vendita di prodotti extra – sito. L’unica differenza è che non abbiamo ancora un sistema centralizzato che monitora la giacenza di questi prodotti. </w:t>
       </w:r>
     </w:p>
     <w:p>
@@ -517,10 +337,7 @@
         </w:numPr>
       </w:pPr>
       <w:r>
-        <w:t xml:space="preserve">Prodotti con stesso onu ma packing group diversi. </w:t>
-      </w:r>
-      <w:r>
-        <w:t>Puoi avere tre prodotti diversi (es. "Sgrassatore X", "Pulitore Y", "Solvente Z") che ricadono tutti sotto lo stesso codice UN 1993. Tuttavia, ognuno ha una composizione diversa.</w:t>
+        <w:t xml:space="preserve">Prodotti con stesso onu ma packing group diversi. Puoi avere tre prodotti diversi (es. "Sgrassatore X", "Pulitore Y", "Solvente Z") che ricadono tutti sotto lo stesso codice UN 1993. Tuttavia, ognuno ha una composizione diversa.</w:t>
       </w:r>
     </w:p>
     <w:p>
@@ -572,14 +389,7 @@
           <w:b/>
           <w:bCs/>
         </w:rPr>
-        <w:t>adr_</w:t>
-      </w:r>
-      <w:r>
-        <w:rPr>
-          <w:b/>
-          <w:bCs/>
-        </w:rPr>
-        <w:t>codici_onu</w:t>
+        <w:t>adr_codici_onu</w:t>
       </w:r>
     </w:p>
     <w:p>
@@ -587,16 +397,7 @@
         <w:pStyle w:val="Nessunaspaziatura"/>
       </w:pPr>
       <w:r>
-        <w:t>La tabella centrale (Tabella A ADR)</w:t>
-      </w:r>
-      <w:r>
-        <w:t xml:space="preserve">. </w:t>
-      </w:r>
-      <w:r>
-        <w:t>Ogni riga corrisponde a una riga della Tabella A. Attenzione: lo stesso un_number può avere più righe (sostanza stessa, stati fisici o concentrazioni diverse → la PK non può essere il solo numero UN).</w:t>
-      </w:r>
-      <w:r>
-        <w:t xml:space="preserve"> </w:t>
+        <w:t xml:space="preserve">La tabella centrale (Tabella A ADR). Ogni riga corrisponde a una riga della Tabella A. Attenzione: lo stesso un_number può avere più righe (sostanza stessa, stati fisici o concentrazioni diverse → la PK non può essere il solo numero UN). </w:t>
       </w:r>
     </w:p>
     <w:p>
@@ -1040,16 +841,7 @@
         </w:numPr>
       </w:pPr>
       <w:r>
-        <w:t>Anche se ora non succede, va previsto che l</w:t>
-      </w:r>
-      <w:r>
-        <w:t>o stesso prodotto p</w:t>
-      </w:r>
-      <w:r>
-        <w:t>ossa</w:t>
-      </w:r>
-      <w:r>
-        <w:t xml:space="preserve"> essere fornito da più fornitori, ognuno con il proprio SKU e nome commerciale</w:t>
+        <w:t xml:space="preserve">Anche se ora non succede, va previsto che lo stesso prodotto possa essere fornito da più fornitori, ognuno con il proprio SKU e nome commerciale</w:t>
       </w:r>
     </w:p>
     <w:p>
@@ -1092,10 +884,7 @@
         </w:numPr>
       </w:pPr>
       <w:r>
-        <w:t>I prodotti possono essere kit/bundle composti da più prodotti</w:t>
-      </w:r>
-      <w:r>
-        <w:t>. Succede sul sito</w:t>
+        <w:t>I prodotti possono essere kit/bundle composti da più prodotti. Succede sul sito</w:t>
       </w:r>
     </w:p>
     <w:p>
@@ -1107,13 +896,7 @@
         </w:numPr>
       </w:pPr>
       <w:r>
-        <w:t>Molti prodotti sono ADR</w:t>
-      </w:r>
-      <w:r>
-        <w:t xml:space="preserve">, cioè pericolosi. Quando un prodotto è ADR ha </w:t>
-      </w:r>
-      <w:r>
-        <w:t xml:space="preserve">un numero ONU, una classe di pericolo e un gruppo di imballaggio (packing group). </w:t>
+        <w:t xml:space="preserve">Molti prodotti sono ADR, cioè pericolosi. Quando un prodotto è ADR ha un numero ONU, una classe di pericolo e un gruppo di imballaggio (packing group). </w:t>
       </w:r>
     </w:p>
     <w:p>
@@ -1174,10 +957,7 @@
         </w:numPr>
       </w:pPr>
       <w:r>
-        <w:t xml:space="preserve">1 tabella per le  prodotto fisico, quello stoccabile e vendibile (ad es cloro in pasticche da 1kg, da 2 kg, etc). </w:t>
-      </w:r>
-      <w:r>
-        <w:t>Ogni variante ha il proprio SKU, peso netto e lordo, codice EAN e unità di misura.</w:t>
+        <w:t xml:space="preserve">1 tabella per le  prodotto fisico, quello stoccabile e vendibile (ad es cloro in pasticche da 1kg, da 2 kg, etc). Ogni variante ha il proprio SKU, peso netto e lordo, codice EAN e unità di misura.</w:t>
       </w:r>
     </w:p>
     <w:p>
@@ -1205,10 +985,7 @@
         </w:numPr>
       </w:pPr>
       <w:r>
-        <w:t xml:space="preserve">Ho almeno 1 campo sku </w:t>
-      </w:r>
-      <w:r>
-        <w:t>“interno” alla web app, 1 per allacciarsi a WooCommerce e almeno 1 per ogni produttore.</w:t>
+        <w:t xml:space="preserve">Ho almeno 1 campo sku “interno” alla web app, 1 per allacciarsi a WooCommerce e almeno 1 per ogni produttore.</w:t>
       </w:r>
     </w:p>
     <w:p>
@@ -1232,19 +1009,7 @@
         </w:numPr>
       </w:pPr>
       <w:r>
-        <w:t xml:space="preserve">Per i prodotti </w:t>
-      </w:r>
-      <w:r>
-        <w:t>ADR (merci pericolose)</w:t>
-      </w:r>
-      <w:r>
-        <w:t>, l</w:t>
-      </w:r>
-      <w:r>
-        <w:t>o schema prevede una tabella adr_sostanze con il numero ONU come chiave primaria, da cui derivano la descrizione ufficiale di spedizione e la classe di pericolo. Questi dati sono fissi e derivano dalla normativa.</w:t>
-      </w:r>
-      <w:r>
-        <w:t xml:space="preserve"> Il codice ONU deriva dalla sostanza, quindi viene salvata nel prodotto master</w:t>
+        <w:t xml:space="preserve">Per i prodotti ADR (merci pericolose), lo schema prevede una tabella adr_sostanze con il numero ONU come chiave primaria, da cui derivano la descrizione ufficiale di spedizione e la classe di pericolo. Questi dati sono fissi e derivano dalla normativa. Il codice ONU deriva dalla sostanza, quindi viene salvata nel prodotto master</w:t>
       </w:r>
     </w:p>
     <w:p>
@@ -1256,13 +1021,7 @@
         </w:numPr>
       </w:pPr>
       <w:r>
-        <w:t xml:space="preserve">Il gruppo di imballaggio (packing group) </w:t>
-      </w:r>
-      <w:r>
-        <w:t xml:space="preserve">(altro parametro ADR) dipende invece dalla variante di un prodotto perché </w:t>
-      </w:r>
-      <w:r>
-        <w:t>può variare per lo stesso numero ONU in funzione della concentrazione o della formulazione.</w:t>
+        <w:t xml:space="preserve">Il gruppo di imballaggio (packing group) (altro parametro ADR) dipende invece dalla variante di un prodotto perché può variare per lo stesso numero ONU in funzione della concentrazione o della formulazione.</w:t>
       </w:r>
     </w:p>
     <w:p>
@@ -1323,24 +1082,33 @@
         </w:numPr>
       </w:pPr>
       <w:r>
-        <w:t>Tabella codici ONU</w:t>
-      </w:r>
-      <w:r>
-        <w:t xml:space="preserve"> (equivalente di </w:t>
+        <w:t xml:space="preserve">Tabella codici ONU (equivalente di </w:t>
       </w:r>
       <w:r>
         <w:rPr>
           <w:b/>
           <w:bCs/>
         </w:rPr>
-        <w:t>adr_nazioni_unite</w:t>
+        <w:t>adr_nazioni_unite)</w:t>
+      </w:r>
+    </w:p>
+    <w:p>
+      <w:pPr>
+        <w:pStyle w:val="Paragrafoelenco"/>
+        <w:numPr>
+          <w:ilvl w:val="1"/>
+          <w:numId w:val="5"/>
+        </w:numPr>
+      </w:pPr>
+      <w:r>
+        <w:t xml:space="preserve">Tabella versioni codici ONU, con date di validità, packing group, e quantità per esenzione ( è simile alla nostra </w:t>
       </w:r>
       <w:r>
         <w:rPr>
           <w:b/>
           <w:bCs/>
         </w:rPr>
-        <w:t>)</w:t>
+        <w:t>adr_prodotti_dettaglio)</w:t>
       </w:r>
     </w:p>
     <w:p>
@@ -1352,24 +1120,7 @@
         </w:numPr>
       </w:pPr>
       <w:r>
-        <w:t>Tabella versioni codici ONU, con date di validità, packing group, e quantità per esenzione</w:t>
-      </w:r>
-      <w:r>
-        <w:t xml:space="preserve"> ( è simile alla nostra </w:t>
-      </w:r>
-      <w:r>
-        <w:rPr>
-          <w:b/>
-          <w:bCs/>
-        </w:rPr>
-        <w:t>adr_prodotti_dettaglio</w:t>
-      </w:r>
-      <w:r>
-        <w:rPr>
-          <w:b/>
-          <w:bCs/>
-        </w:rPr>
-        <w:t>)</w:t>
+        <w:t xml:space="preserve">BaAdrGruppiImballaggio e BaAdrClassiPericolo</w:t>
       </w:r>
     </w:p>
     <w:p>
@@ -1381,13 +1132,7 @@
         </w:numPr>
       </w:pPr>
       <w:r>
-        <w:t>BaAdrGruppiImballaggio</w:t>
-      </w:r>
-      <w:r>
-        <w:t xml:space="preserve"> e </w:t>
-      </w:r>
-      <w:r>
-        <w:t>BaAdrClassiPericolo</w:t>
+        <w:t>Etichette</w:t>
       </w:r>
     </w:p>
     <w:p>
@@ -1399,22 +1144,7 @@
         </w:numPr>
       </w:pPr>
       <w:r>
-        <w:t>Etichette</w:t>
-      </w:r>
-    </w:p>
-    <w:p>
-      <w:pPr>
-        <w:pStyle w:val="Paragrafoelenco"/>
-        <w:numPr>
-          <w:ilvl w:val="1"/>
-          <w:numId w:val="5"/>
-        </w:numPr>
-      </w:pPr>
-      <w:r>
-        <w:t>E</w:t>
-      </w:r>
-      <w:r>
-        <w:t>tc</w:t>
+        <w:t>Etc</w:t>
       </w:r>
     </w:p>
     <w:p>
@@ -1565,10 +1295,7 @@
         </w:rPr>
       </w:pPr>
       <w:r>
-        <w:t>I</w:t>
-      </w:r>
-      <w:r>
-        <w:t xml:space="preserve">n futuro il sistema dovrà integrarsi con il nostro sito WooCommerce, che usa lo stesso magazzino fisico ma è un canale di vendita separato. </w:t>
+        <w:t xml:space="preserve">In futuro il sistema dovrà integrarsi con il nostro sito WooCommerce, che usa lo stesso magazzino fisico ma è un canale di vendita separato. </w:t>
       </w:r>
       <w:r>
         <w:rPr>
@@ -1672,10 +1399,7 @@
         </w:numPr>
       </w:pPr>
       <w:r>
-        <w:t>Mi pare di capire che invece la best practice s</w:t>
-      </w:r>
-      <w:r>
-        <w:t>ia proprio:</w:t>
+        <w:t>Mi pare di capire che invece la best practice sia proprio:</w:t>
       </w:r>
     </w:p>
     <w:p>
@@ -1822,16 +1546,7 @@
     </w:p>
     <w:p>
       <w:r>
-        <w:t>A o</w:t>
-      </w:r>
-      <w:r>
-        <w:t>gni cliente</w:t>
-      </w:r>
-      <w:r>
-        <w:t xml:space="preserve"> quindi si assegna</w:t>
-      </w:r>
-      <w:r>
-        <w:t xml:space="preserve"> un listino di default e uno sconto aggiuntivo in anagrafica. Entrambi si possono cambiare sulla singola offerta senza toccare l'anagrafica.</w:t>
+        <w:t xml:space="preserve">A ogni cliente quindi si assegna un listino di default e uno sconto aggiuntivo in anagrafica. Entrambi si possono cambiare sulla singola offerta senza toccare l'anagrafica.</w:t>
       </w:r>
     </w:p>
     <w:p>
@@ -1876,10 +1591,7 @@
         </w:numPr>
       </w:pPr>
       <w:r>
-        <w:t>D</w:t>
-      </w:r>
-      <w:r>
-        <w:t>evo tenere lo storico di tutte le offerte inviate con relativo esito</w:t>
+        <w:t>Devo tenere lo storico di tutte le offerte inviate con relativo esito</w:t>
       </w:r>
     </w:p>
     <w:p>
@@ -1891,13 +1603,7 @@
         </w:numPr>
       </w:pPr>
       <w:r>
-        <w:t>Un elemento richiesto dal collega è la visibilità del margine in tempo reale. Ogni riga riporta anche il costo unitario di acquisto, copiato dalla tabella prodotti_fornitori al momento della creazione dell'offerta come snapshot</w:t>
-      </w:r>
-      <w:r>
-        <w:t xml:space="preserve"> </w:t>
-      </w:r>
-      <w:r>
-        <w:t>immutabile. Questo permette di calcolare e visualizzare, sia per singola riga sia sull'intera offerta, il margine in euro e in percentuale. Se il prezzo di acquisto cambia nel tempo, i margini delle offerte già emesse rimangono inalterati perché il costo è salvato come dato storico sulla riga, non letto dinamicamente.</w:t>
+        <w:t xml:space="preserve">Un elemento richiesto dal collega è la visibilità del margine in tempo reale. Ogni riga riporta anche il costo unitario di acquisto, copiato dalla tabella prodotti_fornitori al momento della creazione dell'offerta come snapshot immutabile. Questo permette di calcolare e visualizzare, sia per singola riga sia sull'intera offerta, il margine in euro e in percentuale. Se il prezzo di acquisto cambia nel tempo, i margini delle offerte già emesse rimangono inalterati perché il costo è salvato come dato storico sulla riga, non letto dinamicamente.</w:t>
       </w:r>
     </w:p>
     <w:p>
@@ -1917,7 +1623,7 @@
         </w:numPr>
       </w:pPr>
       <w:r>
-        <w:t>Ogni offerta è legata a un cliente, ha un numero progressivo generato automaticamente e passa attraverso un ciclo di stati: bozza, inviata, accettata, rifiutata, scaduta, annullata.</w:t>
+        <w:t>Ogni offerta è legata a un cliente, ha un numero progressivo generato automaticamente e passa attraverso un ciclo di stati: bozza, inviato, accettato, rifiutato, scaduto, annullato.</w:t>
       </w:r>
     </w:p>
     <w:p>
@@ -1929,7 +1635,7 @@
         </w:numPr>
       </w:pPr>
       <w:r>
-        <w:t>Hanno un numero progressivo, un ciclo di stati (bozza, inviata, accettata, rifiutata, scaduta, annullata) e uno storico dei cambi di stato con note.</w:t>
+        <w:t>Hanno un numero progressivo, un ciclo di stati (bozza, inviato, accettato, rifiutato, scaduto, annullato) e uno storico dei cambi di stato con note.</w:t>
       </w:r>
     </w:p>
     <w:p>
@@ -2018,10 +1724,7 @@
         <w:pStyle w:val="Titolo3"/>
       </w:pPr>
       <w:r>
-        <w:t>Scelte di progett</w:t>
-      </w:r>
-      <w:r>
-        <w:t>o</w:t>
+        <w:t>Scelte di progetto</w:t>
       </w:r>
     </w:p>
     <w:p>
@@ -2088,28 +1791,7 @@
         </w:numPr>
       </w:pPr>
       <w:r>
-        <w:t xml:space="preserve">Quando dobbiamo comprare merce creiamo un ordine fornitore con testata (fornitore, date, stato, condizioni pagamento) e righe (prodotto, </w:t>
-      </w:r>
-      <w:r>
-        <w:t>quantità</w:t>
-      </w:r>
-      <w:r>
-        <w:t xml:space="preserve"> ordinata, </w:t>
-      </w:r>
-      <w:r>
-        <w:t>quantità</w:t>
-      </w:r>
-      <w:r>
-        <w:t xml:space="preserve"> gi</w:t>
-      </w:r>
-      <w:r>
-        <w:t>à</w:t>
-      </w:r>
-      <w:r>
-        <w:t xml:space="preserve"> ricevuta, prezzo).</w:t>
-      </w:r>
-      <w:r>
-        <w:t xml:space="preserve"> Deve poter essere stampato in pdf per essere inviato a fornitore</w:t>
+        <w:t xml:space="preserve">Quando dobbiamo comprare merce creiamo un ordine fornitore con testata (fornitore, date, stato, condizioni pagamento) e righe (prodotto, quantità ordinata, quantità già ricevuta, prezzo). Deve poter essere stampato in pdf per essere inviato a fornitore</w:t>
       </w:r>
     </w:p>
     <w:p>
@@ -2133,16 +1815,7 @@
         </w:numPr>
       </w:pPr>
       <w:r>
-        <w:t xml:space="preserve">Devo poter </w:t>
-      </w:r>
-      <w:r>
-        <w:t>gesti</w:t>
-      </w:r>
-      <w:r>
-        <w:t>re</w:t>
-      </w:r>
-      <w:r>
-        <w:t xml:space="preserve"> le consegne parziali.</w:t>
+        <w:t xml:space="preserve">Devo poter gestire le consegne parziali.</w:t>
       </w:r>
     </w:p>
     <w:p>
@@ -2154,13 +1827,7 @@
         </w:numPr>
       </w:pPr>
       <w:r>
-        <w:t>Quando la merce arriva il sistema genera i movimenti di carico</w:t>
-      </w:r>
-      <w:r>
-        <w:t xml:space="preserve"> in magazzino</w:t>
-      </w:r>
-      <w:r>
-        <w:t>.</w:t>
+        <w:t xml:space="preserve">Quando la merce arriva il sistema genera i movimenti di carico in magazzino.</w:t>
       </w:r>
     </w:p>
     <w:p>
@@ -2292,10 +1959,7 @@
         </w:numPr>
       </w:pPr>
       <w:r>
-        <w:t>La UX si basa su materiali salvati in locale</w:t>
-      </w:r>
-      <w:r>
-        <w:t>, caricati nell’header</w:t>
+        <w:t>La UX si basa su materiali salvati in locale, caricati nell’header</w:t>
       </w:r>
     </w:p>
     <w:p>
@@ -2307,16 +1971,7 @@
         </w:numPr>
       </w:pPr>
       <w:r>
-        <w:t xml:space="preserve">CSS </w:t>
-      </w:r>
-      <w:r>
-        <w:t>P</w:t>
-      </w:r>
-      <w:r>
-        <w:t>ico</w:t>
-      </w:r>
-      <w:r>
-        <w:t xml:space="preserve"> + altri eventuali con stesse caratteristiche (molto usati, molto documentati, che posso semplicemente scaricare in una cartella del progetto)</w:t>
+        <w:t xml:space="preserve">CSS Pico + altri eventuali con stesse caratteristiche (molto usati, molto documentati, che posso semplicemente scaricare in una cartella del progetto)</w:t>
       </w:r>
     </w:p>
     <w:p>

</xml_diff>